<commit_message>
refactor: migrate project to leaf-only PlantVillage workflow
</commit_message>
<xml_diff>
--- a/deliverables/report/实验报告_叶片分类_CBAM.docx
+++ b/deliverables/report/实验报告_叶片分类_CBAM.docx
@@ -22,7 +22,7 @@
         <w:rPr>
           <w:sz w:val="22"/>
         </w:rPr>
-        <w:t>题目：基于 ResNet50 + CBAM 的花卉图像分类与消融实验</w:t>
+        <w:t>题目：基于 ResNet50 + CBAM 的叶片图像分类与消融实验</w:t>
       </w:r>
     </w:p>
     <w:p>
@@ -33,7 +33,7 @@
         <w:rPr>
           <w:sz w:val="22"/>
         </w:rPr>
-        <w:t>生成日期：2026-05-27</w:t>
+        <w:t>生成日期：2026-05-29</w:t>
       </w:r>
     </w:p>
     <w:p/>
@@ -60,7 +60,7 @@
     </w:p>
     <w:p>
       <w:r>
-        <w:t>数据来源：TensorFlow Flowers 公共数据集（公开下载地址见参考文献），本项目离线构建为 processed_data 格式。</w:t>
+        <w:t>数据来源：PlantVillage 公开叶片数据集（公开下载地址见参考文献），本项目离线构建为 processed_data 格式。</w:t>
       </w:r>
     </w:p>
     <w:p>
@@ -139,7 +139,7 @@
           </w:tcPr>
           <w:p>
             <w:r>
-              <w:t>daisy</w:t>
+              <w:t>Orange___Haunglongbing_(Citrus_greening)</w:t>
             </w:r>
           </w:p>
         </w:tc>
@@ -181,7 +181,7 @@
           </w:tcPr>
           <w:p>
             <w:r>
-              <w:t>dandelion</w:t>
+              <w:t>Tomato___Tomato_Yellow_Leaf_Curl_Virus</w:t>
             </w:r>
           </w:p>
         </w:tc>
@@ -223,7 +223,7 @@
           </w:tcPr>
           <w:p>
             <w:r>
-              <w:t>roses</w:t>
+              <w:t>Soybean___healthy</w:t>
             </w:r>
           </w:p>
         </w:tc>
@@ -265,7 +265,7 @@
           </w:tcPr>
           <w:p>
             <w:r>
-              <w:t>sunflowers</w:t>
+              <w:t>Peach___Bacterial_spot</w:t>
             </w:r>
           </w:p>
         </w:tc>
@@ -307,7 +307,7 @@
           </w:tcPr>
           <w:p>
             <w:r>
-              <w:t>tulips</w:t>
+              <w:t>Tomato___Bacterial_spot</w:t>
             </w:r>
           </w:p>
         </w:tc>
@@ -333,47 +333,6 @@
         </w:tc>
       </w:tr>
     </w:tbl>
-    <w:p>
-      <w:r>
-        <w:t>图 1 类别分布：</w:t>
-      </w:r>
-    </w:p>
-    <w:p>
-      <w:r>
-        <w:drawing>
-          <wp:inline xmlns:a="http://schemas.openxmlformats.org/drawingml/2006/main" xmlns:pic="http://schemas.openxmlformats.org/drawingml/2006/picture">
-            <wp:extent cx="5669280" cy="1889760"/>
-            <wp:docPr id="1" name="Picture 1"/>
-            <wp:cNvGraphicFramePr>
-              <a:graphicFrameLocks noChangeAspect="1"/>
-            </wp:cNvGraphicFramePr>
-            <a:graphic>
-              <a:graphicData uri="http://schemas.openxmlformats.org/drawingml/2006/picture">
-                <pic:pic>
-                  <pic:nvPicPr>
-                    <pic:cNvPr id="0" name="class_distribution.png"/>
-                    <pic:cNvPicPr/>
-                  </pic:nvPicPr>
-                  <pic:blipFill>
-                    <a:blip r:embed="rId9"/>
-                    <a:stretch>
-                      <a:fillRect/>
-                    </a:stretch>
-                  </pic:blipFill>
-                  <pic:spPr>
-                    <a:xfrm>
-                      <a:off x="0" y="0"/>
-                      <a:ext cx="5669280" cy="1889760"/>
-                    </a:xfrm>
-                    <a:prstGeom prst="rect"/>
-                  </pic:spPr>
-                </pic:pic>
-              </a:graphicData>
-            </a:graphic>
-          </wp:inline>
-        </w:drawing>
-      </w:r>
-    </w:p>
     <w:p>
       <w:pPr>
         <w:pStyle w:val="Heading1"/>
@@ -521,7 +480,7 @@
           </w:tcPr>
           <w:p>
             <w:r>
-              <w:t>88.67%</w:t>
+              <w:t>84.00%</w:t>
             </w:r>
           </w:p>
         </w:tc>
@@ -531,7 +490,7 @@
           </w:tcPr>
           <w:p>
             <w:r>
-              <w:t>0.3251</w:t>
+              <w:t>0.5405</w:t>
             </w:r>
           </w:p>
         </w:tc>
@@ -563,7 +522,7 @@
           </w:tcPr>
           <w:p>
             <w:r>
-              <w:t>88.00%</w:t>
+              <w:t>84.00%</w:t>
             </w:r>
           </w:p>
         </w:tc>
@@ -573,7 +532,7 @@
           </w:tcPr>
           <w:p>
             <w:r>
-              <w:t>0.3920</w:t>
+              <w:t>0.5127</w:t>
             </w:r>
           </w:p>
         </w:tc>
@@ -605,7 +564,7 @@
           </w:tcPr>
           <w:p>
             <w:r>
-              <w:t>88.00%</w:t>
+              <w:t>64.00%</w:t>
             </w:r>
           </w:p>
         </w:tc>
@@ -615,7 +574,7 @@
           </w:tcPr>
           <w:p>
             <w:r>
-              <w:t>0.4960</w:t>
+              <w:t>1.5305</w:t>
             </w:r>
           </w:p>
         </w:tc>
@@ -647,7 +606,7 @@
           </w:tcPr>
           <w:p>
             <w:r>
-              <w:t>84.00%</w:t>
+              <w:t>76.00%</w:t>
             </w:r>
           </w:p>
         </w:tc>
@@ -657,7 +616,7 @@
           </w:tcPr>
           <w:p>
             <w:r>
-              <w:t>0.8292</w:t>
+              <w:t>1.5348</w:t>
             </w:r>
           </w:p>
         </w:tc>
@@ -675,130 +634,7 @@
     </w:tbl>
     <w:p>
       <w:r>
-        <w:t>最好结果：ResNet50 baseline，验证准确率 88.67%，验证损失 0.3251。</w:t>
-      </w:r>
-    </w:p>
-    <w:p>
-      <w:r>
-        <w:t>图 2 baseline 训练曲线</w:t>
-      </w:r>
-    </w:p>
-    <w:p>
-      <w:r>
-        <w:drawing>
-          <wp:inline xmlns:a="http://schemas.openxmlformats.org/drawingml/2006/main" xmlns:pic="http://schemas.openxmlformats.org/drawingml/2006/picture">
-            <wp:extent cx="5486400" cy="2743200"/>
-            <wp:docPr id="2" name="Picture 2"/>
-            <wp:cNvGraphicFramePr>
-              <a:graphicFrameLocks noChangeAspect="1"/>
-            </wp:cNvGraphicFramePr>
-            <a:graphic>
-              <a:graphicData uri="http://schemas.openxmlformats.org/drawingml/2006/picture">
-                <pic:pic>
-                  <pic:nvPicPr>
-                    <pic:cNvPr id="0" name="accuracy_curve.png"/>
-                    <pic:cNvPicPr/>
-                  </pic:nvPicPr>
-                  <pic:blipFill>
-                    <a:blip r:embed="rId10"/>
-                    <a:stretch>
-                      <a:fillRect/>
-                    </a:stretch>
-                  </pic:blipFill>
-                  <pic:spPr>
-                    <a:xfrm>
-                      <a:off x="0" y="0"/>
-                      <a:ext cx="5486400" cy="2743200"/>
-                    </a:xfrm>
-                    <a:prstGeom prst="rect"/>
-                  </pic:spPr>
-                </pic:pic>
-              </a:graphicData>
-            </a:graphic>
-          </wp:inline>
-        </w:drawing>
-      </w:r>
-    </w:p>
-    <w:p>
-      <w:r>
-        <w:t>图 3 CBAM 训练曲线</w:t>
-      </w:r>
-    </w:p>
-    <w:p>
-      <w:r>
-        <w:drawing>
-          <wp:inline xmlns:a="http://schemas.openxmlformats.org/drawingml/2006/main" xmlns:pic="http://schemas.openxmlformats.org/drawingml/2006/picture">
-            <wp:extent cx="5486400" cy="2743200"/>
-            <wp:docPr id="3" name="Picture 3"/>
-            <wp:cNvGraphicFramePr>
-              <a:graphicFrameLocks noChangeAspect="1"/>
-            </wp:cNvGraphicFramePr>
-            <a:graphic>
-              <a:graphicData uri="http://schemas.openxmlformats.org/drawingml/2006/picture">
-                <pic:pic>
-                  <pic:nvPicPr>
-                    <pic:cNvPr id="0" name="accuracy_curve.png"/>
-                    <pic:cNvPicPr/>
-                  </pic:nvPicPr>
-                  <pic:blipFill>
-                    <a:blip r:embed="rId11"/>
-                    <a:stretch>
-                      <a:fillRect/>
-                    </a:stretch>
-                  </pic:blipFill>
-                  <pic:spPr>
-                    <a:xfrm>
-                      <a:off x="0" y="0"/>
-                      <a:ext cx="5486400" cy="2743200"/>
-                    </a:xfrm>
-                    <a:prstGeom prst="rect"/>
-                  </pic:spPr>
-                </pic:pic>
-              </a:graphicData>
-            </a:graphic>
-          </wp:inline>
-        </w:drawing>
-      </w:r>
-    </w:p>
-    <w:p>
-      <w:r>
-        <w:t>图 4 CBAM+MixUp/CutMix 混淆矩阵</w:t>
-      </w:r>
-    </w:p>
-    <w:p>
-      <w:r>
-        <w:drawing>
-          <wp:inline xmlns:a="http://schemas.openxmlformats.org/drawingml/2006/main" xmlns:pic="http://schemas.openxmlformats.org/drawingml/2006/picture">
-            <wp:extent cx="5486400" cy="4389120"/>
-            <wp:docPr id="4" name="Picture 4"/>
-            <wp:cNvGraphicFramePr>
-              <a:graphicFrameLocks noChangeAspect="1"/>
-            </wp:cNvGraphicFramePr>
-            <a:graphic>
-              <a:graphicData uri="http://schemas.openxmlformats.org/drawingml/2006/picture">
-                <pic:pic>
-                  <pic:nvPicPr>
-                    <pic:cNvPr id="0" name="confusion_matrix.png"/>
-                    <pic:cNvPicPr/>
-                  </pic:nvPicPr>
-                  <pic:blipFill>
-                    <a:blip r:embed="rId12"/>
-                    <a:stretch>
-                      <a:fillRect/>
-                    </a:stretch>
-                  </pic:blipFill>
-                  <pic:spPr>
-                    <a:xfrm>
-                      <a:off x="0" y="0"/>
-                      <a:ext cx="5486400" cy="4389120"/>
-                    </a:xfrm>
-                    <a:prstGeom prst="rect"/>
-                  </pic:spPr>
-                </pic:pic>
-              </a:graphicData>
-            </a:graphic>
-          </wp:inline>
-        </w:drawing>
+        <w:t>最好结果：ResNet50 baseline，验证准确率 84.00%，验证损失 0.5405。</w:t>
       </w:r>
     </w:p>
     <w:p>
@@ -1000,12 +836,12 @@
     </w:p>
     <w:p>
       <w:r>
-        <w:t>[3] TensorFlow Datasets: tf_flowers.</w:t>
+        <w:t>[3] PlantVillage Dataset.</w:t>
       </w:r>
     </w:p>
     <w:p>
       <w:r>
-        <w:t>[4] Download URL: https://storage.googleapis.com/download.tensorflow.org/example_images/flower_photos.tgz</w:t>
+        <w:t>[4] Download URL: https://github.com/spMohanty/PlantVillage-Dataset</w:t>
       </w:r>
     </w:p>
     <w:sectPr>

</xml_diff>